<commit_message>
feat: add hyperlink styling for CV links in templates and renderer
</commit_message>
<xml_diff>
--- a/public/templates/cv-en.docx
+++ b/public/templates/cv-en.docx
@@ -31,7 +31,35 @@
           <w:sz w:val="18"/>
           <w:szCs w:val="18"/>
         </w:rPr>
-        <w:t xml:space="preserve">{#basicInfo.links}{label} / {/basicInfo.links}</w:t>
+        <w:t xml:space="preserve">{#basicInfo.links}</w:t>
+      </w:r>
+      <w:r>
+        <w:rPr>
+          <w:rFonts w:ascii="Calibri" w:cs="Calibri" w:eastAsia="Calibri" w:hAnsi="Calibri"/>
+          <w:color w:val="0563C1"/>
+          <w:sz w:val="18"/>
+          <w:szCs w:val="18"/>
+          <w:u w:val="single" w:color="0563C1"/>
+        </w:rPr>
+        <w:t xml:space="preserve">{label}</w:t>
+      </w:r>
+      <w:r>
+        <w:rPr>
+          <w:rFonts w:ascii="Calibri" w:cs="Calibri" w:eastAsia="Calibri" w:hAnsi="Calibri"/>
+          <w:color w:val="888888"/>
+          <w:sz w:val="18"/>
+          <w:szCs w:val="18"/>
+        </w:rPr>
+        <w:t xml:space="preserve"> / </w:t>
+      </w:r>
+      <w:r>
+        <w:rPr>
+          <w:rFonts w:ascii="Calibri" w:cs="Calibri" w:eastAsia="Calibri" w:hAnsi="Calibri"/>
+          <w:color w:val="000000"/>
+          <w:sz w:val="18"/>
+          <w:szCs w:val="18"/>
+        </w:rPr>
+        <w:t xml:space="preserve">{/basicInfo.links}</w:t>
       </w:r>
       <w:r>
         <w:rPr>

</xml_diff>